<commit_message>
Sprint 8 - Module Prestations
</commit_message>
<xml_diff>
--- a/templates/contrat_cession.docx
+++ b/templates/contrat_cession.docx
@@ -1261,16 +1261,12 @@
         </w:rPr>
       </w:pPr>
       <w:r>
-        <w:t>Adresse : {{</w:t>
+        <w:t>Lieu : {{prestation_lieu_complet}}</w:t>
       </w:r>
       <w:proofErr w:type="spellStart"/>
-      <w:r>
-        <w:t>organisateur_adresse</w:t>
-      </w:r>
+      <w:r/>
       <w:proofErr w:type="spellEnd"/>
-      <w:r>
-        <w:t>}}</w:t>
-      </w:r>
+      <w:r/>
     </w:p>
     <w:p>
       <w:pPr>

</xml_diff>

<commit_message>
v0.5 - Producteur, Prestations et Contrat finalisé
</commit_message>
<xml_diff>
--- a/templates/contrat_cession.docx
+++ b/templates/contrat_cession.docx
@@ -6153,278 +6153,6 @@
           <w:sz w:val="18"/>
           <w:szCs w:val="18"/>
         </w:rPr>
-      </w:pPr>
-    </w:p>
-    <w:p>
-      <w:pPr>
-        <w:pBdr>
-          <w:top w:val="nil"/>
-          <w:left w:val="nil"/>
-          <w:bottom w:val="nil"/>
-          <w:right w:val="nil"/>
-          <w:between w:val="nil"/>
-        </w:pBdr>
-        <w:spacing w:line="493" w:lineRule="auto"/>
-        <w:ind w:right="4980"/>
-        <w:rPr>
-          <w:sz w:val="18"/>
-          <w:szCs w:val="18"/>
-        </w:rPr>
-      </w:pPr>
-    </w:p>
-    <w:p>
-      <w:pPr>
-        <w:pBdr>
-          <w:top w:val="nil"/>
-          <w:left w:val="nil"/>
-          <w:bottom w:val="nil"/>
-          <w:right w:val="nil"/>
-          <w:between w:val="nil"/>
-        </w:pBdr>
-        <w:spacing w:line="493" w:lineRule="auto"/>
-        <w:ind w:right="4980"/>
-        <w:rPr>
-          <w:sz w:val="18"/>
-          <w:szCs w:val="18"/>
-        </w:rPr>
-      </w:pPr>
-    </w:p>
-    <w:p>
-      <w:pPr>
-        <w:pBdr>
-          <w:top w:val="nil"/>
-          <w:left w:val="nil"/>
-          <w:bottom w:val="nil"/>
-          <w:right w:val="nil"/>
-          <w:between w:val="nil"/>
-        </w:pBdr>
-        <w:spacing w:line="493" w:lineRule="auto"/>
-        <w:ind w:right="4980"/>
-        <w:rPr>
-          <w:sz w:val="18"/>
-          <w:szCs w:val="18"/>
-        </w:rPr>
-      </w:pPr>
-    </w:p>
-    <w:p>
-      <w:pPr>
-        <w:pBdr>
-          <w:top w:val="nil"/>
-          <w:left w:val="nil"/>
-          <w:bottom w:val="nil"/>
-          <w:right w:val="nil"/>
-          <w:between w:val="nil"/>
-        </w:pBdr>
-        <w:spacing w:line="493" w:lineRule="auto"/>
-        <w:ind w:right="4980"/>
-        <w:rPr>
-          <w:sz w:val="18"/>
-          <w:szCs w:val="18"/>
-        </w:rPr>
-      </w:pPr>
-    </w:p>
-    <w:p>
-      <w:pPr>
-        <w:pBdr>
-          <w:top w:val="nil"/>
-          <w:left w:val="nil"/>
-          <w:bottom w:val="nil"/>
-          <w:right w:val="nil"/>
-          <w:between w:val="nil"/>
-        </w:pBdr>
-        <w:spacing w:line="493" w:lineRule="auto"/>
-        <w:ind w:right="4980"/>
-        <w:rPr>
-          <w:sz w:val="18"/>
-          <w:szCs w:val="18"/>
-        </w:rPr>
-      </w:pPr>
-    </w:p>
-    <w:p>
-      <w:pPr>
-        <w:pBdr>
-          <w:top w:val="nil"/>
-          <w:left w:val="nil"/>
-          <w:bottom w:val="nil"/>
-          <w:right w:val="nil"/>
-          <w:between w:val="nil"/>
-        </w:pBdr>
-        <w:spacing w:line="493" w:lineRule="auto"/>
-        <w:ind w:right="4980"/>
-        <w:rPr>
-          <w:sz w:val="18"/>
-          <w:szCs w:val="18"/>
-        </w:rPr>
-      </w:pPr>
-    </w:p>
-    <w:p>
-      <w:pPr>
-        <w:pBdr>
-          <w:top w:val="nil"/>
-          <w:left w:val="nil"/>
-          <w:bottom w:val="nil"/>
-          <w:right w:val="nil"/>
-          <w:between w:val="nil"/>
-        </w:pBdr>
-        <w:spacing w:line="493" w:lineRule="auto"/>
-        <w:ind w:right="4980"/>
-        <w:rPr>
-          <w:sz w:val="18"/>
-          <w:szCs w:val="18"/>
-        </w:rPr>
-      </w:pPr>
-    </w:p>
-    <w:p>
-      <w:pPr>
-        <w:pBdr>
-          <w:top w:val="nil"/>
-          <w:left w:val="nil"/>
-          <w:bottom w:val="nil"/>
-          <w:right w:val="nil"/>
-          <w:between w:val="nil"/>
-        </w:pBdr>
-        <w:spacing w:line="493" w:lineRule="auto"/>
-        <w:ind w:right="4980"/>
-        <w:rPr>
-          <w:sz w:val="18"/>
-          <w:szCs w:val="18"/>
-        </w:rPr>
-      </w:pPr>
-    </w:p>
-    <w:p>
-      <w:pPr>
-        <w:pBdr>
-          <w:top w:val="nil"/>
-          <w:left w:val="nil"/>
-          <w:bottom w:val="nil"/>
-          <w:right w:val="nil"/>
-          <w:between w:val="nil"/>
-        </w:pBdr>
-        <w:spacing w:line="493" w:lineRule="auto"/>
-        <w:ind w:right="4980"/>
-        <w:rPr>
-          <w:sz w:val="18"/>
-          <w:szCs w:val="18"/>
-        </w:rPr>
-      </w:pPr>
-    </w:p>
-    <w:p>
-      <w:pPr>
-        <w:pBdr>
-          <w:top w:val="nil"/>
-          <w:left w:val="nil"/>
-          <w:bottom w:val="nil"/>
-          <w:right w:val="nil"/>
-          <w:between w:val="nil"/>
-        </w:pBdr>
-        <w:spacing w:line="493" w:lineRule="auto"/>
-        <w:ind w:right="4980"/>
-        <w:rPr>
-          <w:sz w:val="18"/>
-          <w:szCs w:val="18"/>
-        </w:rPr>
-      </w:pPr>
-    </w:p>
-    <w:p>
-      <w:pPr>
-        <w:pBdr>
-          <w:top w:val="nil"/>
-          <w:left w:val="nil"/>
-          <w:bottom w:val="nil"/>
-          <w:right w:val="nil"/>
-          <w:between w:val="nil"/>
-        </w:pBdr>
-        <w:spacing w:line="493" w:lineRule="auto"/>
-        <w:ind w:right="4980"/>
-        <w:rPr>
-          <w:sz w:val="18"/>
-          <w:szCs w:val="18"/>
-        </w:rPr>
-      </w:pPr>
-    </w:p>
-    <w:p>
-      <w:pPr>
-        <w:pBdr>
-          <w:top w:val="nil"/>
-          <w:left w:val="nil"/>
-          <w:bottom w:val="nil"/>
-          <w:right w:val="nil"/>
-          <w:between w:val="nil"/>
-        </w:pBdr>
-        <w:spacing w:line="493" w:lineRule="auto"/>
-        <w:ind w:right="4980"/>
-        <w:rPr>
-          <w:sz w:val="18"/>
-          <w:szCs w:val="18"/>
-        </w:rPr>
-      </w:pPr>
-    </w:p>
-    <w:p>
-      <w:pPr>
-        <w:pBdr>
-          <w:top w:val="nil"/>
-          <w:left w:val="nil"/>
-          <w:bottom w:val="nil"/>
-          <w:right w:val="nil"/>
-          <w:between w:val="nil"/>
-        </w:pBdr>
-        <w:spacing w:line="493" w:lineRule="auto"/>
-        <w:ind w:right="4980"/>
-        <w:rPr>
-          <w:sz w:val="18"/>
-          <w:szCs w:val="18"/>
-        </w:rPr>
-      </w:pPr>
-    </w:p>
-    <w:p>
-      <w:pPr>
-        <w:pBdr>
-          <w:top w:val="nil"/>
-          <w:left w:val="nil"/>
-          <w:bottom w:val="nil"/>
-          <w:right w:val="nil"/>
-          <w:between w:val="nil"/>
-        </w:pBdr>
-        <w:spacing w:line="493" w:lineRule="auto"/>
-        <w:ind w:right="4980"/>
-        <w:rPr>
-          <w:sz w:val="18"/>
-          <w:szCs w:val="18"/>
-        </w:rPr>
-      </w:pPr>
-    </w:p>
-    <w:p>
-      <w:pPr>
-        <w:pBdr>
-          <w:top w:val="nil"/>
-          <w:left w:val="nil"/>
-          <w:bottom w:val="nil"/>
-          <w:right w:val="nil"/>
-          <w:between w:val="nil"/>
-        </w:pBdr>
-        <w:spacing w:line="493" w:lineRule="auto"/>
-        <w:ind w:right="4980"/>
-        <w:rPr>
-          <w:sz w:val="18"/>
-          <w:szCs w:val="18"/>
-        </w:rPr>
-      </w:pPr>
-    </w:p>
-    <w:p>
-      <w:pPr>
-        <w:pBdr>
-          <w:top w:val="nil"/>
-          <w:left w:val="nil"/>
-          <w:bottom w:val="nil"/>
-          <w:right w:val="nil"/>
-          <w:between w:val="nil"/>
-        </w:pBdr>
-        <w:spacing w:line="493" w:lineRule="auto"/>
-        <w:ind w:right="4980"/>
-        <w:rPr>
-          <w:sz w:val="18"/>
-          <w:szCs w:val="18"/>
-        </w:rPr>
         <w:sectPr>
           <w:type w:val="continuous"/>
           <w:pgSz w:w="11910" w:h="16840"/>
@@ -6450,137 +6178,29 @@
         </w:rPr>
       </w:pPr>
     </w:p>
-    <w:p>
-      <w:pPr>
-        <w:pStyle w:val="Titre3"/>
-        <w:rPr>
-          <w:rFonts w:ascii="Calibri" w:eastAsia="Calibri" w:hAnsi="Calibri" w:cs="Calibri"/>
-          <w:sz w:val="32"/>
-          <w:szCs w:val="32"/>
-        </w:rPr>
-      </w:pPr>
-      <w:bookmarkStart w:id="21" w:name="bookmark=id.rpkbbljta9ov" w:colFirst="0" w:colLast="0"/>
-      <w:bookmarkEnd w:id="21"/>
-      <w:r>
-        <w:rPr>
-          <w:rFonts w:ascii="Calibri" w:eastAsia="Calibri" w:hAnsi="Calibri" w:cs="Calibri"/>
-          <w:sz w:val="32"/>
-          <w:szCs w:val="32"/>
-        </w:rPr>
-        <w:t>POUR YGNT PRODUCTION</w:t>
-      </w:r>
-    </w:p>
-    <w:p>
-      <w:pPr>
-        <w:pBdr>
-          <w:top w:val="nil"/>
-          <w:left w:val="nil"/>
-          <w:bottom w:val="nil"/>
-          <w:right w:val="nil"/>
-          <w:between w:val="nil"/>
-        </w:pBdr>
-        <w:spacing w:before="246"/>
-        <w:rPr>
-          <w:color w:val="000000"/>
-          <w:sz w:val="18"/>
-          <w:szCs w:val="18"/>
-        </w:rPr>
-      </w:pPr>
-      <w:r>
-        <w:rPr>
-          <w:color w:val="000000"/>
-          <w:sz w:val="18"/>
-          <w:szCs w:val="18"/>
-        </w:rPr>
-        <w:lastRenderedPageBreak/>
-        <w:t>M. Tanguy ZAHN</w:t>
-      </w:r>
-      <w:r>
-        <w:rPr>
-          <w:sz w:val="18"/>
-          <w:szCs w:val="18"/>
-        </w:rPr>
-        <w:t xml:space="preserve">, </w:t>
-      </w:r>
-      <w:r>
-        <w:rPr>
-          <w:color w:val="000000"/>
-          <w:sz w:val="18"/>
-          <w:szCs w:val="18"/>
-        </w:rPr>
-        <w:t>Président</w:t>
-      </w:r>
-    </w:p>
-    <w:p>
-      <w:pPr>
-        <w:pBdr>
-          <w:top w:val="nil"/>
-          <w:left w:val="nil"/>
-          <w:bottom w:val="nil"/>
-          <w:right w:val="nil"/>
-          <w:between w:val="nil"/>
-        </w:pBdr>
-        <w:spacing w:before="16"/>
-        <w:rPr>
-          <w:color w:val="000000"/>
-          <w:sz w:val="18"/>
-          <w:szCs w:val="18"/>
-        </w:rPr>
-      </w:pPr>
-    </w:p>
-    <w:p>
-      <w:pPr>
-        <w:pBdr>
-          <w:top w:val="nil"/>
-          <w:left w:val="nil"/>
-          <w:bottom w:val="nil"/>
-          <w:right w:val="nil"/>
-          <w:between w:val="nil"/>
-        </w:pBdr>
-        <w:spacing w:line="493" w:lineRule="auto"/>
-        <w:ind w:right="4980"/>
-        <w:rPr>
-          <w:color w:val="000000"/>
-          <w:sz w:val="18"/>
-          <w:szCs w:val="18"/>
-        </w:rPr>
-      </w:pPr>
-      <w:r>
-        <w:rPr>
-          <w:color w:val="000000"/>
-          <w:sz w:val="18"/>
-          <w:szCs w:val="18"/>
-        </w:rPr>
-        <w:t xml:space="preserve">Mention manuscrite : « Lu et approuvé » Signature :  </w:t>
-      </w:r>
-      <w:r>
-        <w:rPr>
-          <w:noProof/>
-        </w:rPr>
+    <w:p/>
+    <w:p/>
+    <w:p>
+      <w:pPr>
+        <w:jc w:val="center"/>
+      </w:pPr>
+      <w:r>
         <w:drawing>
-          <wp:anchor distT="114300" distB="114300" distL="114300" distR="114300" simplePos="0" relativeHeight="251677696" behindDoc="0" locked="0" layoutInCell="1" hidden="0" allowOverlap="1" wp14:anchorId="7E124E4D" wp14:editId="1F52D7B6">
-            <wp:simplePos x="0" y="0"/>
-            <wp:positionH relativeFrom="column">
-              <wp:posOffset>533400</wp:posOffset>
-            </wp:positionH>
-            <wp:positionV relativeFrom="paragraph">
-              <wp:posOffset>466725</wp:posOffset>
-            </wp:positionV>
-            <wp:extent cx="1267484" cy="837445"/>
-            <wp:effectExtent l="0" t="0" r="0" b="0"/>
-            <wp:wrapNone/>
-            <wp:docPr id="22" name="image1.jpg"/>
-            <wp:cNvGraphicFramePr/>
-            <a:graphic xmlns:a="http://schemas.openxmlformats.org/drawingml/2006/main">
+          <wp:inline xmlns:a="http://schemas.openxmlformats.org/drawingml/2006/main" xmlns:pic="http://schemas.openxmlformats.org/drawingml/2006/picture">
+            <wp:extent cx="1800000" cy="534375"/>
+            <wp:docPr id="23" name="Picture 23"/>
+            <wp:cNvGraphicFramePr>
+              <a:graphicFrameLocks noChangeAspect="1"/>
+            </wp:cNvGraphicFramePr>
+            <a:graphic>
               <a:graphicData uri="http://schemas.openxmlformats.org/drawingml/2006/picture">
-                <pic:pic xmlns:pic="http://schemas.openxmlformats.org/drawingml/2006/picture">
+                <pic:pic>
                   <pic:nvPicPr>
-                    <pic:cNvPr id="0" name="image1.jpg"/>
-                    <pic:cNvPicPr preferRelativeResize="0"/>
+                    <pic:cNvPr id="0" name="image.jpg"/>
+                    <pic:cNvPicPr/>
                   </pic:nvPicPr>
                   <pic:blipFill>
-                    <a:blip r:embed="rId11"/>
-                    <a:srcRect/>
+                    <a:blip r:embed="rId14"/>
                     <a:stretch>
                       <a:fillRect/>
                     </a:stretch>
@@ -6588,314 +6208,146 @@
                   <pic:spPr>
                     <a:xfrm>
                       <a:off x="0" y="0"/>
-                      <a:ext cx="1267484" cy="837445"/>
+                      <a:ext cx="1800000" cy="534375"/>
                     </a:xfrm>
-                    <a:prstGeom prst="rect">
-                      <a:avLst/>
-                    </a:prstGeom>
-                    <a:ln/>
+                    <a:prstGeom prst="rect"/>
                   </pic:spPr>
                 </pic:pic>
               </a:graphicData>
             </a:graphic>
-          </wp:anchor>
+          </wp:inline>
         </w:drawing>
       </w:r>
     </w:p>
-    <w:p>
-      <w:pPr>
-        <w:pBdr>
-          <w:top w:val="nil"/>
-          <w:left w:val="nil"/>
-          <w:bottom w:val="nil"/>
-          <w:right w:val="nil"/>
-          <w:between w:val="nil"/>
-        </w:pBdr>
-        <w:spacing w:before="42"/>
-        <w:rPr>
-          <w:color w:val="000000"/>
-          <w:sz w:val="18"/>
-          <w:szCs w:val="18"/>
-        </w:rPr>
-      </w:pPr>
-    </w:p>
-    <w:p>
-      <w:pPr>
-        <w:pStyle w:val="Titre3"/>
-      </w:pPr>
-      <w:bookmarkStart w:id="22" w:name="bookmark=id.hwjc2wc1yt95" w:colFirst="0" w:colLast="0"/>
-      <w:bookmarkEnd w:id="22"/>
-    </w:p>
-    <w:p>
-      <w:pPr>
-        <w:pStyle w:val="Titre3"/>
-        <w:rPr>
-          <w:rFonts w:ascii="Calibri" w:eastAsia="Calibri" w:hAnsi="Calibri" w:cs="Calibri"/>
-          <w:sz w:val="32"/>
-          <w:szCs w:val="32"/>
-        </w:rPr>
-      </w:pPr>
-    </w:p>
-    <w:p>
-      <w:pPr>
-        <w:pStyle w:val="Titre3"/>
-        <w:rPr>
-          <w:rFonts w:ascii="Calibri" w:eastAsia="Calibri" w:hAnsi="Calibri" w:cs="Calibri"/>
-          <w:sz w:val="32"/>
-          <w:szCs w:val="32"/>
-        </w:rPr>
-      </w:pPr>
-    </w:p>
-    <w:p>
-      <w:pPr>
-        <w:pStyle w:val="Titre3"/>
-        <w:rPr>
-          <w:rFonts w:ascii="Calibri" w:eastAsia="Calibri" w:hAnsi="Calibri" w:cs="Calibri"/>
-          <w:sz w:val="32"/>
-          <w:szCs w:val="32"/>
-        </w:rPr>
-      </w:pPr>
-      <w:r>
-        <w:rPr>
-          <w:noProof/>
-        </w:rPr>
-        <mc:AlternateContent>
-          <mc:Choice Requires="wps">
-            <w:drawing>
-              <wp:anchor distT="0" distB="0" distL="0" distR="0" simplePos="0" relativeHeight="251678720" behindDoc="0" locked="0" layoutInCell="1" hidden="0" allowOverlap="1" wp14:anchorId="482A1EC8" wp14:editId="12EBCB4E">
-                <wp:simplePos x="0" y="0"/>
-                <wp:positionH relativeFrom="column">
-                  <wp:posOffset>-789</wp:posOffset>
-                </wp:positionH>
-                <wp:positionV relativeFrom="paragraph">
-                  <wp:posOffset>133196</wp:posOffset>
-                </wp:positionV>
-                <wp:extent cx="5579110" cy="12700"/>
-                <wp:effectExtent l="0" t="0" r="0" b="0"/>
-                <wp:wrapNone/>
-                <wp:docPr id="8" name="Forme libre : forme 8"/>
-                <wp:cNvGraphicFramePr/>
-                <a:graphic xmlns:a="http://schemas.openxmlformats.org/drawingml/2006/main">
-                  <a:graphicData uri="http://schemas.microsoft.com/office/word/2010/wordprocessingShape">
-                    <wps:wsp>
-                      <wps:cNvSpPr/>
-                      <wps:spPr>
-                        <a:xfrm>
-                          <a:off x="2556445" y="3775238"/>
-                          <a:ext cx="5579110" cy="9525"/>
-                        </a:xfrm>
-                        <a:custGeom>
-                          <a:avLst/>
-                          <a:gdLst/>
-                          <a:ahLst/>
-                          <a:cxnLst/>
-                          <a:rect l="l" t="t" r="r" b="b"/>
-                          <a:pathLst>
-                            <a:path w="5579110" h="9525" extrusionOk="0">
-                              <a:moveTo>
-                                <a:pt x="5578800" y="9525"/>
-                              </a:moveTo>
-                              <a:lnTo>
-                                <a:pt x="0" y="9525"/>
-                              </a:lnTo>
-                              <a:lnTo>
-                                <a:pt x="0" y="0"/>
-                              </a:lnTo>
-                              <a:lnTo>
-                                <a:pt x="5578800" y="0"/>
-                              </a:lnTo>
-                              <a:lnTo>
-                                <a:pt x="5578800" y="9525"/>
-                              </a:lnTo>
-                              <a:close/>
-                            </a:path>
-                          </a:pathLst>
-                        </a:custGeom>
-                        <a:solidFill>
-                          <a:srgbClr val="BABABA"/>
-                        </a:solidFill>
-                        <a:ln>
-                          <a:noFill/>
-                        </a:ln>
-                      </wps:spPr>
-                      <wps:bodyPr spcFirstLastPara="1" wrap="square" lIns="91425" tIns="91425" rIns="91425" bIns="91425" anchor="ctr" anchorCtr="0">
-                        <a:noAutofit/>
-                      </wps:bodyPr>
-                    </wps:wsp>
-                  </a:graphicData>
-                </a:graphic>
-              </wp:anchor>
-            </w:drawing>
-          </mc:Choice>
-          <mc:Fallback xmlns:cr="http://schemas.microsoft.com/office/comments/2020/reactions" xmlns="http://schemas.microsoft.com/office/tasks/2019/documenttasks" xmlns:dgm="http://schemas.openxmlformats.org/drawingml/2006/diagram" xmlns:lc="http://schemas.openxmlformats.org/drawingml/2006/lockedCanvas" xmlns:c="http://schemas.openxmlformats.org/drawingml/2006/chart" xmlns:pic="http://schemas.openxmlformats.org/drawingml/2006/picture" xmlns:a="http://schemas.openxmlformats.org/drawingml/2006/main" xmlns:sl="http://schemas.openxmlformats.org/schemaLibrary/2006/main">
-            <w:drawing>
-              <wp:anchor allowOverlap="1" behindDoc="0" distB="0" distT="0" distL="0" distR="0" hidden="0" layoutInCell="1" locked="0" relativeHeight="0" simplePos="0">
-                <wp:simplePos x="0" y="0"/>
-                <wp:positionH relativeFrom="column">
-                  <wp:posOffset>-789</wp:posOffset>
-                </wp:positionH>
-                <wp:positionV relativeFrom="paragraph">
-                  <wp:posOffset>133196</wp:posOffset>
-                </wp:positionV>
-                <wp:extent cx="5579110" cy="12700"/>
-                <wp:effectExtent b="0" l="0" r="0" t="0"/>
-                <wp:wrapNone/>
-                <wp:docPr id="8" name="image10.png"/>
-                <a:graphic>
-                  <a:graphicData uri="http://schemas.openxmlformats.org/drawingml/2006/picture">
-                    <pic:pic>
-                      <pic:nvPicPr>
-                        <pic:cNvPr id="0" name="image10.png"/>
-                        <pic:cNvPicPr preferRelativeResize="0"/>
-                      </pic:nvPicPr>
-                      <pic:blipFill>
-                        <a:blip r:embed="rId10"/>
-                        <a:srcRect/>
-                        <a:stretch>
-                          <a:fillRect/>
-                        </a:stretch>
-                      </pic:blipFill>
-                      <pic:spPr>
-                        <a:xfrm>
-                          <a:off x="0" y="0"/>
-                          <a:ext cx="5579110" cy="12700"/>
-                        </a:xfrm>
-                        <a:prstGeom prst="rect"/>
-                        <a:ln/>
-                      </pic:spPr>
-                    </pic:pic>
-                  </a:graphicData>
-                </a:graphic>
-              </wp:anchor>
-            </w:drawing>
-          </mc:Fallback>
-        </mc:AlternateContent>
-      </w:r>
-    </w:p>
-    <w:p>
-      <w:pPr>
-        <w:pStyle w:val="Titre3"/>
-        <w:rPr>
-          <w:rFonts w:ascii="Calibri" w:eastAsia="Calibri" w:hAnsi="Calibri" w:cs="Calibri"/>
-          <w:sz w:val="32"/>
-          <w:szCs w:val="32"/>
-        </w:rPr>
-      </w:pPr>
-    </w:p>
-    <w:p>
-      <w:pPr>
-        <w:pStyle w:val="Titre3"/>
-        <w:rPr>
-          <w:rFonts w:ascii="Calibri" w:eastAsia="Calibri" w:hAnsi="Calibri" w:cs="Calibri"/>
-          <w:sz w:val="32"/>
-          <w:szCs w:val="32"/>
-        </w:rPr>
-      </w:pPr>
-      <w:r>
-        <w:rPr>
-          <w:rFonts w:ascii="Calibri" w:eastAsia="Calibri" w:hAnsi="Calibri" w:cs="Calibri"/>
-          <w:sz w:val="32"/>
-          <w:szCs w:val="32"/>
-        </w:rPr>
-        <w:t>POUR L'ORGANISATEUR</w:t>
-      </w:r>
-    </w:p>
-    <w:p>
-      <w:pPr>
-        <w:pBdr>
-          <w:top w:val="nil"/>
-          <w:left w:val="nil"/>
-          <w:bottom w:val="nil"/>
-          <w:right w:val="nil"/>
-          <w:between w:val="nil"/>
-        </w:pBdr>
-        <w:tabs>
-          <w:tab w:val="left" w:pos="813"/>
-        </w:tabs>
-        <w:spacing w:before="246"/>
-        <w:rPr>
-          <w:rFonts w:ascii="Times New Roman" w:eastAsia="Times New Roman" w:hAnsi="Times New Roman" w:cs="Times New Roman"/>
-          <w:color w:val="000000"/>
-          <w:sz w:val="18"/>
-          <w:szCs w:val="18"/>
-        </w:rPr>
-      </w:pPr>
-      <w:r>
-        <w:rPr>
-          <w:color w:val="000000"/>
-          <w:sz w:val="18"/>
-          <w:szCs w:val="18"/>
-        </w:rPr>
-        <w:t xml:space="preserve">Nom : </w:t>
-      </w:r>
-    </w:p>
-    <w:p>
-      <w:pPr>
-        <w:pBdr>
-          <w:top w:val="nil"/>
-          <w:left w:val="nil"/>
-          <w:bottom w:val="nil"/>
-          <w:right w:val="nil"/>
-          <w:between w:val="nil"/>
-        </w:pBdr>
-        <w:spacing w:before="86"/>
-        <w:rPr>
-          <w:rFonts w:ascii="Times New Roman" w:eastAsia="Times New Roman" w:hAnsi="Times New Roman" w:cs="Times New Roman"/>
-          <w:color w:val="000000"/>
-          <w:sz w:val="18"/>
-          <w:szCs w:val="18"/>
-        </w:rPr>
-      </w:pPr>
-    </w:p>
-    <w:p>
-      <w:pPr>
-        <w:pBdr>
-          <w:top w:val="nil"/>
-          <w:left w:val="nil"/>
-          <w:bottom w:val="nil"/>
-          <w:right w:val="nil"/>
-          <w:between w:val="nil"/>
-        </w:pBdr>
-        <w:tabs>
-          <w:tab w:val="left" w:pos="1299"/>
-        </w:tabs>
-        <w:rPr>
-          <w:rFonts w:ascii="Times New Roman" w:eastAsia="Times New Roman" w:hAnsi="Times New Roman" w:cs="Times New Roman"/>
-          <w:color w:val="000000"/>
-          <w:sz w:val="18"/>
-          <w:szCs w:val="18"/>
-        </w:rPr>
-      </w:pPr>
-      <w:r>
-        <w:t>Fonction : {{</w:t>
-      </w:r>
-      <w:proofErr w:type="spellStart"/>
-      <w:r>
-        <w:t>organisateur_fonction</w:t>
-      </w:r>
-      <w:proofErr w:type="spellEnd"/>
-      <w:r>
-        <w:t>}}</w:t>
-      </w:r>
-    </w:p>
-    <w:p>
-      <w:pPr>
-        <w:pBdr>
-          <w:top w:val="nil"/>
-          <w:left w:val="nil"/>
-          <w:bottom w:val="nil"/>
-          <w:right w:val="nil"/>
-          <w:between w:val="nil"/>
-        </w:pBdr>
-        <w:spacing w:before="86"/>
-        <w:rPr>
-          <w:rFonts w:ascii="Times New Roman" w:eastAsia="Times New Roman" w:hAnsi="Times New Roman" w:cs="Times New Roman"/>
-          <w:color w:val="000000"/>
-          <w:sz w:val="18"/>
-          <w:szCs w:val="18"/>
-        </w:rPr>
-      </w:pPr>
-    </w:p>
+    <w:tbl>
+      <w:tblPr>
+        <w:tblW w:type="auto" w:w="0"/>
+        <w:tblLook w:firstColumn="1" w:firstRow="1" w:lastColumn="0" w:lastRow="0" w:noHBand="0" w:noVBand="1" w:val="04A0"/>
+        <w:tblBorders>
+          <w:top w:val="nil"/>
+          <w:left w:val="nil"/>
+          <w:bottom w:val="nil"/>
+          <w:right w:val="nil"/>
+          <w:insideH w:val="nil"/>
+          <w:insideV w:val="nil"/>
+        </w:tblBorders>
+      </w:tblPr>
+      <w:tblGrid>
+        <w:gridCol w:w="4396"/>
+        <w:gridCol w:w="4396"/>
+      </w:tblGrid>
+      <w:tr>
+        <w:tc>
+          <w:tcPr>
+            <w:tcW w:type="dxa" w:w="4396"/>
+          </w:tcPr>
+          <w:p>
+            <w:pPr>
+              <w:pStyle w:val="Titre3"/>
+            </w:pPr>
+            <w:r>
+              <w:t>POUR YGNT PRODUCTION</w:t>
+            </w:r>
+          </w:p>
+          <w:p>
+            <w:r>
+              <w:t>Nom : M. Tanguy ZAHN</w:t>
+            </w:r>
+          </w:p>
+          <w:p>
+            <w:r>
+              <w:t>Fonction : Président</w:t>
+            </w:r>
+          </w:p>
+          <w:p>
+            <w:r/>
+          </w:p>
+          <w:p>
+            <w:r>
+              <w:t>Mention manuscrite : « Lu et approuvé »</w:t>
+            </w:r>
+          </w:p>
+          <w:p>
+            <w:r>
+              <w:t xml:space="preserve">Signature : </w:t>
+            </w:r>
+          </w:p>
+          <w:p>
+            <w:r>
+              <w:drawing>
+                <wp:inline xmlns:a="http://schemas.openxmlformats.org/drawingml/2006/main" xmlns:pic="http://schemas.openxmlformats.org/drawingml/2006/picture">
+                  <wp:extent cx="1267200" cy="838800"/>
+                  <wp:docPr id="24" name="Picture 24"/>
+                  <wp:cNvGraphicFramePr>
+                    <a:graphicFrameLocks noChangeAspect="1"/>
+                  </wp:cNvGraphicFramePr>
+                  <a:graphic>
+                    <a:graphicData uri="http://schemas.openxmlformats.org/drawingml/2006/picture">
+                      <pic:pic>
+                        <pic:nvPicPr>
+                          <pic:cNvPr id="0" name="image.jpg"/>
+                          <pic:cNvPicPr/>
+                        </pic:nvPicPr>
+                        <pic:blipFill>
+                          <a:blip r:embed="rId11"/>
+                          <a:stretch>
+                            <a:fillRect/>
+                          </a:stretch>
+                        </pic:blipFill>
+                        <pic:spPr>
+                          <a:xfrm>
+                            <a:off x="0" y="0"/>
+                            <a:ext cx="1267200" cy="838800"/>
+                          </a:xfrm>
+                          <a:prstGeom prst="rect"/>
+                        </pic:spPr>
+                      </pic:pic>
+                    </a:graphicData>
+                  </a:graphic>
+                </wp:inline>
+              </w:drawing>
+            </w:r>
+          </w:p>
+        </w:tc>
+        <w:tc>
+          <w:tcPr>
+            <w:tcW w:type="dxa" w:w="4396"/>
+          </w:tcPr>
+          <w:p>
+            <w:pPr>
+              <w:pStyle w:val="Titre3"/>
+            </w:pPr>
+            <w:r>
+              <w:t>POUR L'ORGANISATEUR</w:t>
+            </w:r>
+          </w:p>
+          <w:p>
+            <w:r>
+              <w:t>Nom : {{organisateur_representant}}</w:t>
+            </w:r>
+          </w:p>
+          <w:p>
+            <w:r>
+              <w:t>Fonction : {{organisateur_fonction}}</w:t>
+            </w:r>
+          </w:p>
+          <w:p>
+            <w:r/>
+          </w:p>
+          <w:p>
+            <w:r>
+              <w:t>Mention manuscrite : « Lu et approuvé »</w:t>
+            </w:r>
+          </w:p>
+          <w:p>
+            <w:r>
+              <w:t xml:space="preserve">Signature : </w:t>
+            </w:r>
+          </w:p>
+          <w:p/>
+        </w:tc>
+      </w:tr>
+    </w:tbl>
     <w:p>
       <w:pPr>
         <w:pBdr>
@@ -6909,265 +6361,6 @@
         <w:ind w:right="4980"/>
         <w:rPr>
           <w:color w:val="000000"/>
-          <w:sz w:val="18"/>
-          <w:szCs w:val="18"/>
-        </w:rPr>
-      </w:pPr>
-      <w:r>
-        <w:rPr>
-          <w:color w:val="000000"/>
-          <w:sz w:val="18"/>
-          <w:szCs w:val="18"/>
-        </w:rPr>
-        <w:t xml:space="preserve">Mention manuscrite : </w:t>
-      </w:r>
-      <w:r>
-        <w:rPr>
-          <w:sz w:val="18"/>
-          <w:szCs w:val="18"/>
-        </w:rPr>
-        <w:t>“</w:t>
-      </w:r>
-      <w:r>
-        <w:rPr>
-          <w:color w:val="000000"/>
-          <w:sz w:val="18"/>
-          <w:szCs w:val="18"/>
-        </w:rPr>
-        <w:t>Lu et approuvé</w:t>
-      </w:r>
-      <w:r>
-        <w:rPr>
-          <w:sz w:val="18"/>
-          <w:szCs w:val="18"/>
-        </w:rPr>
-        <w:t>”</w:t>
-      </w:r>
-    </w:p>
-    <w:p>
-      <w:pPr>
-        <w:pBdr>
-          <w:top w:val="nil"/>
-          <w:left w:val="nil"/>
-          <w:bottom w:val="nil"/>
-          <w:right w:val="nil"/>
-          <w:between w:val="nil"/>
-        </w:pBdr>
-        <w:spacing w:line="493" w:lineRule="auto"/>
-        <w:ind w:right="4980"/>
-        <w:rPr>
-          <w:color w:val="000000"/>
-          <w:sz w:val="18"/>
-          <w:szCs w:val="18"/>
-        </w:rPr>
-      </w:pPr>
-      <w:r>
-        <w:rPr>
-          <w:color w:val="000000"/>
-          <w:sz w:val="18"/>
-          <w:szCs w:val="18"/>
-        </w:rPr>
-        <w:t xml:space="preserve">Signature : </w:t>
-      </w:r>
-    </w:p>
-    <w:p>
-      <w:pPr>
-        <w:pBdr>
-          <w:top w:val="nil"/>
-          <w:left w:val="nil"/>
-          <w:bottom w:val="nil"/>
-          <w:right w:val="nil"/>
-          <w:between w:val="nil"/>
-        </w:pBdr>
-        <w:spacing w:line="493" w:lineRule="auto"/>
-        <w:ind w:right="4980"/>
-        <w:rPr>
-          <w:color w:val="000000"/>
-          <w:sz w:val="18"/>
-          <w:szCs w:val="18"/>
-        </w:rPr>
-      </w:pPr>
-    </w:p>
-    <w:p>
-      <w:pPr>
-        <w:pBdr>
-          <w:top w:val="nil"/>
-          <w:left w:val="nil"/>
-          <w:bottom w:val="nil"/>
-          <w:right w:val="nil"/>
-          <w:between w:val="nil"/>
-        </w:pBdr>
-        <w:spacing w:line="493" w:lineRule="auto"/>
-        <w:ind w:right="4980"/>
-        <w:rPr>
-          <w:color w:val="000000"/>
-          <w:sz w:val="18"/>
-          <w:szCs w:val="18"/>
-        </w:rPr>
-      </w:pPr>
-    </w:p>
-    <w:p>
-      <w:pPr>
-        <w:pBdr>
-          <w:top w:val="nil"/>
-          <w:left w:val="nil"/>
-          <w:bottom w:val="nil"/>
-          <w:right w:val="nil"/>
-          <w:between w:val="nil"/>
-        </w:pBdr>
-        <w:spacing w:line="493" w:lineRule="auto"/>
-        <w:ind w:right="4980"/>
-        <w:rPr>
-          <w:sz w:val="18"/>
-          <w:szCs w:val="18"/>
-        </w:rPr>
-      </w:pPr>
-    </w:p>
-    <w:p>
-      <w:pPr>
-        <w:pBdr>
-          <w:top w:val="nil"/>
-          <w:left w:val="nil"/>
-          <w:bottom w:val="nil"/>
-          <w:right w:val="nil"/>
-          <w:between w:val="nil"/>
-        </w:pBdr>
-        <w:spacing w:line="493" w:lineRule="auto"/>
-        <w:ind w:right="4980"/>
-        <w:rPr>
-          <w:sz w:val="18"/>
-          <w:szCs w:val="18"/>
-        </w:rPr>
-      </w:pPr>
-      <w:r>
-        <w:rPr>
-          <w:noProof/>
-        </w:rPr>
-        <mc:AlternateContent>
-          <mc:Choice Requires="wps">
-            <w:drawing>
-              <wp:anchor distT="0" distB="0" distL="0" distR="0" simplePos="0" relativeHeight="251679744" behindDoc="0" locked="0" layoutInCell="1" hidden="0" allowOverlap="1" wp14:anchorId="7AE33158" wp14:editId="78E8FE24">
-                <wp:simplePos x="0" y="0"/>
-                <wp:positionH relativeFrom="column">
-                  <wp:posOffset>-789</wp:posOffset>
-                </wp:positionH>
-                <wp:positionV relativeFrom="paragraph">
-                  <wp:posOffset>131635</wp:posOffset>
-                </wp:positionV>
-                <wp:extent cx="5579110" cy="12700"/>
-                <wp:effectExtent l="0" t="0" r="0" b="0"/>
-                <wp:wrapNone/>
-                <wp:docPr id="4" name="Forme libre : forme 4"/>
-                <wp:cNvGraphicFramePr/>
-                <a:graphic xmlns:a="http://schemas.openxmlformats.org/drawingml/2006/main">
-                  <a:graphicData uri="http://schemas.microsoft.com/office/word/2010/wordprocessingShape">
-                    <wps:wsp>
-                      <wps:cNvSpPr/>
-                      <wps:spPr>
-                        <a:xfrm>
-                          <a:off x="2556445" y="3775238"/>
-                          <a:ext cx="5579110" cy="9525"/>
-                        </a:xfrm>
-                        <a:custGeom>
-                          <a:avLst/>
-                          <a:gdLst/>
-                          <a:ahLst/>
-                          <a:cxnLst/>
-                          <a:rect l="l" t="t" r="r" b="b"/>
-                          <a:pathLst>
-                            <a:path w="5579110" h="9525" extrusionOk="0">
-                              <a:moveTo>
-                                <a:pt x="5578800" y="9525"/>
-                              </a:moveTo>
-                              <a:lnTo>
-                                <a:pt x="0" y="9525"/>
-                              </a:lnTo>
-                              <a:lnTo>
-                                <a:pt x="0" y="0"/>
-                              </a:lnTo>
-                              <a:lnTo>
-                                <a:pt x="5578800" y="0"/>
-                              </a:lnTo>
-                              <a:lnTo>
-                                <a:pt x="5578800" y="9525"/>
-                              </a:lnTo>
-                              <a:close/>
-                            </a:path>
-                          </a:pathLst>
-                        </a:custGeom>
-                        <a:solidFill>
-                          <a:srgbClr val="BABABA"/>
-                        </a:solidFill>
-                        <a:ln>
-                          <a:noFill/>
-                        </a:ln>
-                      </wps:spPr>
-                      <wps:bodyPr spcFirstLastPara="1" wrap="square" lIns="91425" tIns="91425" rIns="91425" bIns="91425" anchor="ctr" anchorCtr="0">
-                        <a:noAutofit/>
-                      </wps:bodyPr>
-                    </wps:wsp>
-                  </a:graphicData>
-                </a:graphic>
-              </wp:anchor>
-            </w:drawing>
-          </mc:Choice>
-          <mc:Fallback xmlns:cr="http://schemas.microsoft.com/office/comments/2020/reactions" xmlns="http://schemas.microsoft.com/office/tasks/2019/documenttasks" xmlns:dgm="http://schemas.openxmlformats.org/drawingml/2006/diagram" xmlns:lc="http://schemas.openxmlformats.org/drawingml/2006/lockedCanvas" xmlns:c="http://schemas.openxmlformats.org/drawingml/2006/chart" xmlns:pic="http://schemas.openxmlformats.org/drawingml/2006/picture" xmlns:a="http://schemas.openxmlformats.org/drawingml/2006/main" xmlns:sl="http://schemas.openxmlformats.org/schemaLibrary/2006/main">
-            <w:drawing>
-              <wp:anchor allowOverlap="1" behindDoc="0" distB="0" distT="0" distL="0" distR="0" hidden="0" layoutInCell="1" locked="0" relativeHeight="0" simplePos="0">
-                <wp:simplePos x="0" y="0"/>
-                <wp:positionH relativeFrom="column">
-                  <wp:posOffset>-789</wp:posOffset>
-                </wp:positionH>
-                <wp:positionV relativeFrom="paragraph">
-                  <wp:posOffset>131635</wp:posOffset>
-                </wp:positionV>
-                <wp:extent cx="5579110" cy="12700"/>
-                <wp:effectExtent b="0" l="0" r="0" t="0"/>
-                <wp:wrapNone/>
-                <wp:docPr id="4" name="image6.png"/>
-                <a:graphic>
-                  <a:graphicData uri="http://schemas.openxmlformats.org/drawingml/2006/picture">
-                    <pic:pic>
-                      <pic:nvPicPr>
-                        <pic:cNvPr id="0" name="image6.png"/>
-                        <pic:cNvPicPr preferRelativeResize="0"/>
-                      </pic:nvPicPr>
-                      <pic:blipFill>
-                        <a:blip r:embed="rId10"/>
-                        <a:srcRect/>
-                        <a:stretch>
-                          <a:fillRect/>
-                        </a:stretch>
-                      </pic:blipFill>
-                      <pic:spPr>
-                        <a:xfrm>
-                          <a:off x="0" y="0"/>
-                          <a:ext cx="5579110" cy="12700"/>
-                        </a:xfrm>
-                        <a:prstGeom prst="rect"/>
-                        <a:ln/>
-                      </pic:spPr>
-                    </pic:pic>
-                  </a:graphicData>
-                </a:graphic>
-              </wp:anchor>
-            </w:drawing>
-          </mc:Fallback>
-        </mc:AlternateContent>
-      </w:r>
-    </w:p>
-    <w:p>
-      <w:pPr>
-        <w:pBdr>
-          <w:top w:val="nil"/>
-          <w:left w:val="nil"/>
-          <w:bottom w:val="nil"/>
-          <w:right w:val="nil"/>
-          <w:between w:val="nil"/>
-        </w:pBdr>
-        <w:spacing w:line="493" w:lineRule="auto"/>
-        <w:ind w:right="4980"/>
-        <w:rPr>
           <w:sz w:val="18"/>
           <w:szCs w:val="18"/>
         </w:rPr>

</xml_diff>

<commit_message>
v0.5 - Architecture métier finalisée
</commit_message>
<xml_diff>
--- a/templates/contrat_cession.docx
+++ b/templates/contrat_cession.docx
@@ -82,7 +82,7 @@
           <w:b w:val="0"/>
           <w:bCs w:val="0"/>
         </w:rPr>
-        <w:t>YGNT Production</w:t>
+        <w:t>{{producteur_nom}}</w:t>
       </w:r>
     </w:p>
     <w:p>
@@ -107,7 +107,7 @@
           <w:sz w:val="18"/>
           <w:szCs w:val="18"/>
         </w:rPr>
-        <w:t>Association régie par la loi du 1er juillet 1901</w:t>
+        <w:t>{{producteur_forme_juridique}}</w:t>
       </w:r>
     </w:p>
     <w:p>
@@ -161,7 +161,7 @@
           <w:sz w:val="18"/>
           <w:szCs w:val="18"/>
         </w:rPr>
-        <w:t xml:space="preserve"> : 28 rue Joseph Roumanille 04180 VILLENEUVE</w:t>
+        <w:t xml:space="preserve"> : {{producteur_adresse}} {{producteur_code_postal}} {{producteur_ville}}</w:t>
       </w:r>
     </w:p>
     <w:p>
@@ -199,7 +199,7 @@
           <w:sz w:val="18"/>
           <w:szCs w:val="18"/>
         </w:rPr>
-        <w:t xml:space="preserve"> : 10572314200011</w:t>
+        <w:t xml:space="preserve"> : {{producteur_siret}}</w:t>
       </w:r>
     </w:p>
     <w:p>
@@ -237,7 +237,7 @@
           <w:sz w:val="18"/>
           <w:szCs w:val="18"/>
         </w:rPr>
-        <w:t> : 2-021977</w:t>
+        <w:t xml:space="preserve"> : {{producteur_licence}}</w:t>
       </w:r>
     </w:p>
     <w:p>
@@ -281,7 +281,7 @@
           <w:sz w:val="18"/>
           <w:szCs w:val="18"/>
         </w:rPr>
-        <w:t>Représentée par Monsieur Tanguy ZAHN, Président, Ci-après dénommée « Le Producteur »,</w:t>
+        <w:t>Représentée par {{producteur_representant}}, {{producteur_fonction}}, Ci-après dénommée « Le Producteur »,</w:t>
       </w:r>
     </w:p>
     <w:p>
@@ -3468,7 +3468,7 @@
           <w:sz w:val="18"/>
           <w:szCs w:val="18"/>
         </w:rPr>
-        <w:t>YGNT Production étant non assujettie à la TVA :</w:t>
+        <w:t>{{producteur_nom}} étant non assujettie à la TVA :</w:t>
       </w:r>
     </w:p>
     <w:p>
@@ -6019,7 +6019,7 @@
           <w:sz w:val="18"/>
           <w:szCs w:val="18"/>
         </w:rPr>
-        <w:t>À défaut d'accord, les juridictions compétentes du ressort du siège social de YGNT Production seront seules compétentes.</w:t>
+        <w:t>À défaut d'accord, les juridictions compétentes du ressort du siège social de {{producteur_nom}} seront seules compétentes.</w:t>
       </w:r>
       <w:r>
         <w:rPr>
@@ -6246,17 +6246,17 @@
               <w:pStyle w:val="Titre3"/>
             </w:pPr>
             <w:r>
-              <w:t>POUR YGNT PRODUCTION</w:t>
+              <w:t>POUR {{producteur_nom}}</w:t>
             </w:r>
           </w:p>
           <w:p>
             <w:r>
-              <w:t>Nom : M. Tanguy ZAHN</w:t>
+              <w:t>Nom : {{producteur_representant}}</w:t>
             </w:r>
           </w:p>
           <w:p>
             <w:r>
-              <w:t>Fonction : Président</w:t>
+              <w:t>Fonction : {{producteur_fonction}}</w:t>
             </w:r>
           </w:p>
           <w:p>
@@ -6520,7 +6520,7 @@
         <w:sz w:val="14"/>
         <w:szCs w:val="14"/>
       </w:rPr>
-      <w:t>Association loi 1901 – SIREN : 105 723 142  – Code APE 9001Z –  N° RNA  : W044007357</w:t>
+      <w:t>{{producteur_forme_juridique}} – SIREN : 105 723 142  – Code APE {{producteur_ape}} –  N° RNA  : W044007357</w:t>
     </w:r>
   </w:p>
   <w:p>
@@ -6573,7 +6573,7 @@
         <w:sz w:val="14"/>
         <w:szCs w:val="14"/>
       </w:rPr>
-      <w:t>YGNT PRODUCTION 28 rue Jospeh Roumanille -  04180 VILLENEUVE -  Tél : 06 20 28 43 85 –  Mail : contact.ygnt@gmail.com</w:t>
+      <w:t>{{producteur_nom}} {{producteur_adresse}} -  {{producteur_code_postal}} {{producteur_ville}} -  Tél : {{producteur_telephone}} –  Mail : {{producteur_email}}</w:t>
     </w:r>
   </w:p>
   <w:p>

</xml_diff>

<commit_message>
v0.9.3 - Identité graphique unifiée des documents
</commit_message>
<xml_diff>
--- a/templates/contrat_cession.docx
+++ b/templates/contrat_cession.docx
@@ -6224,13 +6224,19 @@
         <w:tblW w:type="auto" w:w="0"/>
         <w:tblLook w:firstColumn="1" w:firstRow="1" w:lastColumn="0" w:lastRow="0" w:noHBand="0" w:noVBand="1" w:val="04A0"/>
         <w:tblBorders>
-          <w:top w:val="nil"/>
-          <w:left w:val="nil"/>
-          <w:bottom w:val="nil"/>
-          <w:right w:val="nil"/>
-          <w:insideH w:val="nil"/>
-          <w:insideV w:val="nil"/>
+          <w:top w:val="single" w:sz="6" w:space="0" w:color="7A1428"/>
+          <w:left w:val="single" w:sz="6" w:space="0" w:color="7A1428"/>
+          <w:bottom w:val="single" w:sz="6" w:space="0" w:color="7A1428"/>
+          <w:right w:val="single" w:sz="6" w:space="0" w:color="7A1428"/>
+          <w:insideH w:val="single" w:sz="6" w:space="0" w:color="7A1428"/>
+          <w:insideV w:val="single" w:sz="6" w:space="0" w:color="7A1428"/>
         </w:tblBorders>
+        <w:tblCellMar>
+          <w:top w:w="100" w:type="dxa"/>
+          <w:left w:w="150" w:type="dxa"/>
+          <w:bottom w:w="100" w:type="dxa"/>
+          <w:right w:w="150" w:type="dxa"/>
+        </w:tblCellMar>
       </w:tblPr>
       <w:tblGrid>
         <w:gridCol w:w="4396"/>
@@ -6272,42 +6278,7 @@
               <w:t xml:space="preserve">Signature : </w:t>
             </w:r>
           </w:p>
-          <w:p>
-            <w:r>
-              <w:drawing>
-                <wp:inline xmlns:a="http://schemas.openxmlformats.org/drawingml/2006/main" xmlns:pic="http://schemas.openxmlformats.org/drawingml/2006/picture">
-                  <wp:extent cx="1267200" cy="838800"/>
-                  <wp:docPr id="24" name="Picture 24"/>
-                  <wp:cNvGraphicFramePr>
-                    <a:graphicFrameLocks noChangeAspect="1"/>
-                  </wp:cNvGraphicFramePr>
-                  <a:graphic>
-                    <a:graphicData uri="http://schemas.openxmlformats.org/drawingml/2006/picture">
-                      <pic:pic>
-                        <pic:nvPicPr>
-                          <pic:cNvPr id="0" name="image.jpg"/>
-                          <pic:cNvPicPr/>
-                        </pic:nvPicPr>
-                        <pic:blipFill>
-                          <a:blip r:embed="rId11"/>
-                          <a:stretch>
-                            <a:fillRect/>
-                          </a:stretch>
-                        </pic:blipFill>
-                        <pic:spPr>
-                          <a:xfrm>
-                            <a:off x="0" y="0"/>
-                            <a:ext cx="1267200" cy="838800"/>
-                          </a:xfrm>
-                          <a:prstGeom prst="rect"/>
-                        </pic:spPr>
-                      </pic:pic>
-                    </a:graphicData>
-                  </a:graphic>
-                </wp:inline>
-              </w:drawing>
-            </w:r>
-          </w:p>
+          <w:p/>
         </w:tc>
         <w:tc>
           <w:tcPr>
@@ -6389,7 +6360,7 @@
           <w:sz w:val="18"/>
           <w:szCs w:val="18"/>
         </w:rPr>
-        <w:t>Fait à : Villeneuve</w:t>
+        <w:t xml:space="preserve">Fait à : </w:t>
       </w:r>
     </w:p>
     <w:p>
@@ -6507,16 +6478,16 @@
       </w:tabs>
       <w:jc w:val="center"/>
       <w:rPr>
-        <w:rFonts w:ascii="Cambria" w:eastAsia="Cambria" w:hAnsi="Cambria" w:cs="Cambria"/>
-        <w:color w:val="000000"/>
+        <w:rFonts w:ascii="Calibri" w:eastAsia="Calibri" w:hAnsi="Calibri" w:cs="Calibri"/>
+        <w:color w:val="6B7280"/>
         <w:sz w:val="14"/>
         <w:szCs w:val="14"/>
       </w:rPr>
     </w:pPr>
     <w:r>
       <w:rPr>
-        <w:rFonts w:ascii="Cambria" w:eastAsia="Cambria" w:hAnsi="Cambria" w:cs="Cambria"/>
-        <w:color w:val="000000"/>
+        <w:rFonts w:ascii="Calibri" w:eastAsia="Calibri" w:hAnsi="Calibri" w:cs="Calibri"/>
+        <w:color w:val="6B7280"/>
         <w:sz w:val="14"/>
         <w:szCs w:val="14"/>
       </w:rPr>
@@ -6538,8 +6509,8 @@
       </w:tabs>
       <w:jc w:val="center"/>
       <w:rPr>
-        <w:rFonts w:ascii="Cambria" w:eastAsia="Cambria" w:hAnsi="Cambria" w:cs="Cambria"/>
-        <w:color w:val="000000"/>
+        <w:rFonts w:ascii="Calibri" w:eastAsia="Calibri" w:hAnsi="Calibri" w:cs="Calibri"/>
+        <w:color w:val="6B7280"/>
         <w:sz w:val="14"/>
         <w:szCs w:val="14"/>
       </w:rPr>
@@ -6560,16 +6531,16 @@
       </w:tabs>
       <w:jc w:val="center"/>
       <w:rPr>
-        <w:rFonts w:ascii="Cambria" w:eastAsia="Cambria" w:hAnsi="Cambria" w:cs="Cambria"/>
-        <w:color w:val="000000"/>
+        <w:rFonts w:ascii="Calibri" w:eastAsia="Calibri" w:hAnsi="Calibri" w:cs="Calibri"/>
+        <w:color w:val="6B7280"/>
         <w:sz w:val="14"/>
         <w:szCs w:val="14"/>
       </w:rPr>
     </w:pPr>
     <w:r>
       <w:rPr>
-        <w:rFonts w:ascii="Cambria" w:eastAsia="Cambria" w:hAnsi="Cambria" w:cs="Cambria"/>
-        <w:color w:val="000000"/>
+        <w:rFonts w:ascii="Calibri" w:eastAsia="Calibri" w:hAnsi="Calibri" w:cs="Calibri"/>
+        <w:color w:val="6B7280"/>
         <w:sz w:val="14"/>
         <w:szCs w:val="14"/>
       </w:rPr>
@@ -7324,9 +7295,10 @@
       <w:outlineLvl w:val="0"/>
     </w:pPr>
     <w:rPr>
-      <w:rFonts w:ascii="Arial Black" w:eastAsia="Arial Black" w:hAnsi="Arial Black" w:cs="Arial Black"/>
+      <w:rFonts w:ascii="Calibri" w:eastAsia="Calibri" w:hAnsi="Calibri" w:cs="Calibri"/>
       <w:b/>
       <w:bCs/>
+      <w:color w:val="7A1428"/>
       <w:sz w:val="36"/>
       <w:szCs w:val="36"/>
     </w:rPr>
@@ -7340,19 +7312,20 @@
     <w:qFormat/>
     <w:pPr>
       <w:pBdr>
-        <w:top w:val="single" w:sz="12" w:space="1" w:color="FDE9D9"/>
-        <w:left w:val="single" w:sz="12" w:space="4" w:color="FDE9D9"/>
-        <w:bottom w:val="single" w:sz="12" w:space="1" w:color="FDE9D9"/>
-        <w:right w:val="single" w:sz="12" w:space="4" w:color="FDE9D9"/>
+        <w:top w:val="single" w:sz="12" w:space="4" w:color="F1E4E7"/>
+        <w:left w:val="single" w:sz="12" w:space="8" w:color="F1E4E7"/>
+        <w:bottom w:val="single" w:sz="12" w:space="4" w:color="F1E4E7"/>
+        <w:right w:val="single" w:sz="12" w:space="8" w:color="F1E4E7"/>
       </w:pBdr>
-      <w:shd w:val="clear" w:color="auto" w:fill="FDE9D9"/>
+      <w:shd w:val="clear" w:color="auto" w:fill="F1E4E7"/>
+      <w:spacing w:before="120" w:after="120"/>
       <w:outlineLvl w:val="1"/>
     </w:pPr>
     <w:rPr>
       <w:rFonts w:ascii="Calibri" w:eastAsia="Calibri" w:hAnsi="Calibri" w:cs="Calibri"/>
       <w:b/>
       <w:bCs/>
-      <w:color w:val="000000"/>
+      <w:color w:val="7A1428"/>
       <w:sz w:val="27"/>
       <w:szCs w:val="27"/>
     </w:rPr>
@@ -7369,9 +7342,10 @@
       <w:outlineLvl w:val="2"/>
     </w:pPr>
     <w:rPr>
-      <w:rFonts w:ascii="Arial Black" w:eastAsia="Arial Black" w:hAnsi="Arial Black" w:cs="Arial Black"/>
+      <w:rFonts w:ascii="Calibri" w:eastAsia="Calibri" w:hAnsi="Calibri" w:cs="Calibri"/>
       <w:b/>
       <w:bCs/>
+      <w:color w:val="7A1428"/>
       <w:sz w:val="21"/>
       <w:szCs w:val="21"/>
     </w:rPr>

</xml_diff>

<commit_message>
v0.9.3 - Refonte graphique des documents
</commit_message>
<xml_diff>
--- a/templates/contrat_cession.docx
+++ b/templates/contrat_cession.docx
@@ -6278,7 +6278,42 @@
               <w:t xml:space="preserve">Signature : </w:t>
             </w:r>
           </w:p>
-          <w:p/>
+          <w:p>
+            <w:r>
+              <w:drawing>
+                <wp:inline xmlns:a="http://schemas.openxmlformats.org/drawingml/2006/main" xmlns:pic="http://schemas.openxmlformats.org/drawingml/2006/picture">
+                  <wp:extent cx="1267200" cy="838800"/>
+                  <wp:docPr id="24" name="Picture 24"/>
+                  <wp:cNvGraphicFramePr>
+                    <a:graphicFrameLocks noChangeAspect="1"/>
+                  </wp:cNvGraphicFramePr>
+                  <a:graphic>
+                    <a:graphicData uri="http://schemas.openxmlformats.org/drawingml/2006/picture">
+                      <pic:pic>
+                        <pic:nvPicPr>
+                          <pic:cNvPr id="0" name="image.jpg"/>
+                          <pic:cNvPicPr/>
+                        </pic:nvPicPr>
+                        <pic:blipFill>
+                          <a:blip r:embed="rId11"/>
+                          <a:stretch>
+                            <a:fillRect/>
+                          </a:stretch>
+                        </pic:blipFill>
+                        <pic:spPr>
+                          <a:xfrm>
+                            <a:off x="0" y="0"/>
+                            <a:ext cx="1267200" cy="838800"/>
+                          </a:xfrm>
+                          <a:prstGeom prst="rect"/>
+                        </pic:spPr>
+                      </pic:pic>
+                    </a:graphicData>
+                  </a:graphic>
+                </wp:inline>
+              </w:drawing>
+            </w:r>
+          </w:p>
         </w:tc>
         <w:tc>
           <w:tcPr>
@@ -6360,7 +6395,7 @@
           <w:sz w:val="18"/>
           <w:szCs w:val="18"/>
         </w:rPr>
-        <w:t xml:space="preserve">Fait à : </w:t>
+        <w:t>Fait à : Villeneuve</w:t>
       </w:r>
     </w:p>
     <w:p>

</xml_diff>